<commit_message>
docs(proposal): price data path after marketfiyati refusal
</commit_message>
<xml_diff>
--- a/plan/proposal/NutriScan_CSE491_Proposal_v0.docx
+++ b/plan/proposal/NutriScan_CSE491_Proposal_v0.docx
@@ -3827,7 +3827,7 @@
         <w:t>Data.</w:t>
       </w:r>
       <w:r>
-        <w:t xml:space="preserve"> Open Food Facts (ODbL) [17] as a mirrored source; a verified catalogue for Migros and A101 (prices from marketfiyati.org.tr if permission is granted, otherwise team-collected prices with a price-age label); 200 team-written Turkish home recipes with an allergen ontology based on the Turkish Food Codex labelling regulation; a versioned health-rule threshold table with a source for every row (Turkish Food Codex nutrition-claim limits, WHO sugar and sodium guidelines [19][20]), reviewed by a dietitian; synthetic households for development.</w:t>
+        <w:t xml:space="preserve"> Open Food Facts (ODbL) [17] as a mirrored source; a verified catalogue for Migros and A101 (team-collected prices refreshed biweekly plus household receipts, each with a price-age label; the public price platform does not provide data or API access for third-party or academic use); 200 team-written Turkish home recipes with an allergen ontology based on the Turkish Food Codex labelling regulation; a versioned health-rule threshold table with a source for every row (Turkish Food Codex nutrition-claim limits, WHO sugar and sodium guidelines [19][20]), reviewed by a dietitian; synthetic households for development.</w:t>
       </w:r>
     </w:p>
     <w:tbl>
@@ -5980,7 +5980,7 @@
               <w:spacing w:after="60"/>
             </w:pPr>
             <w:r>
-              <w:t>Price data permission not granted</w:t>
+              <w:t>Team-collected prices go stale or miss items</w:t>
             </w:r>
           </w:p>
         </w:tc>
@@ -6055,7 +6055,7 @@
               <w:spacing w:after="60"/>
             </w:pPr>
             <w:r>
-              <w:t>Team-collected prices (~300 items, biweekly) with price age</w:t>
+              <w:t>Biweekly price tour (~300 items, split across three members); price age shown on every price; stale price → "could not verify"; CI checks priced-SKU coverage ≥ 90%</w:t>
             </w:r>
           </w:p>
         </w:tc>

</xml_diff>

<commit_message>
docs(plan): thesis v5.2 price path across product definition, proposal and calendar
</commit_message>
<xml_diff>
--- a/plan/proposal/NutriScan_CSE491_Proposal_v0.docx
+++ b/plan/proposal/NutriScan_CSE491_Proposal_v0.docx
@@ -1043,7 +1043,7 @@
         <w:spacing w:after="60"/>
       </w:pPr>
       <w:r>
-        <w:t>4. Create a clean-licensed dataset of Turkish home recipes with an allergen ontology, a verified product catalogue for two chains, and an allergen gold test set.</w:t>
+        <w:t>4. Create a clean-licensed dataset of Turkish home recipes with an allergen ontology, a product catalogue for two pilot chains (ŞOK and Tarım Kredi), and an allergen gold test set.</w:t>
       </w:r>
     </w:p>
     <w:p>
@@ -1119,7 +1119,7 @@
         <w:spacing w:after="60"/>
       </w:pPr>
       <w:r>
-        <w:t>• Beta (E3, spring): 20–40 households (≥10 with a hard constraint); plan/swap acceptance, planned vs. paid amount, use of expiring pantry items, week-4 retention.</w:t>
+        <w:t>• Beta (E3, spring): 20–40 households (≥10 with a hard constraint); plan/swap acceptance, planned price vs. in-store shelf price (periodic sample) and price freshness, use of expiring pantry items, week-4 retention.</w:t>
       </w:r>
     </w:p>
     <w:p>
@@ -2817,7 +2817,7 @@
               <w:spacing w:after="60"/>
             </w:pPr>
             <w:r>
-              <w:t>The system shall maintain a verified catalogue (Migros, then A101) with pack sizes, nutrition tables, prices and price age, and track the pantry (barcode, e-invoice/receipt, "finished").</w:t>
+              <w:t>The system shall maintain a catalogue for two pilot chains (ŞOK, Tarım Kredi) with pack sizes, ingredient text, prices, source and price age, filled by a collector limited to the recipe ingredient dictionary, and track the pantry (barcode, "bought" marks on the list, "finished").</w:t>
             </w:r>
           </w:p>
         </w:tc>
@@ -3827,7 +3827,7 @@
         <w:t>Data.</w:t>
       </w:r>
       <w:r>
-        <w:t xml:space="preserve"> Open Food Facts (ODbL) [17] as a mirrored source; a verified catalogue for Migros and A101 (team-collected prices refreshed biweekly plus household receipts, each with a price-age label; the public price platform does not provide data or API access for third-party or academic use); 200 team-written Turkish home recipes with an allergen ontology based on the Turkish Food Codex labelling regulation; a versioned health-rule threshold table with a source for every row (Turkish Food Codex nutrition-claim limits, WHO sugar and sodium guidelines [19][20]), reviewed by a dietitian; synthetic households for development.</w:t>
+        <w:t xml:space="preserve"> Open Food Facts (ODbL) [17] as a mirrored source; a product and price catalogue for two pilot chains, ŞOK and Tarım Kredi, built by a weekly collector that reads only the products matching our recipe ingredient dictionary from the chains' public web catalogues, following robots.txt with an identified user agent and a rate limit, never bypassing access controls, keeping the source URL and date of every record and not republishing the data (the public price platform does not provide data or API access for third-party or academic use); stale prices are reported as "could not verify"; a public app-store release uses prices only with the chains' written permission or a licensed source; 200 team-written Turkish home recipes with an allergen ontology based on the Turkish Food Codex labelling regulation; a versioned health-rule threshold table with a source for every row (Turkish Food Codex nutrition-claim limits, WHO sugar and sodium guidelines [19][20]), reviewed by a dietitian; synthetic households for development.</w:t>
       </w:r>
     </w:p>
     <w:tbl>
@@ -5106,7 +5106,7 @@
               <w:spacing w:after="60"/>
             </w:pPr>
             <w:r>
-              <w:t>Data factory: recipe schema, ingredient dictionary, allergen ontology, health-rule threshold table, Migros catalogue, 60 recipes with prices</w:t>
+              <w:t>Data factory: recipe schema, ingredient dictionary, allergen ontology, health-rule threshold table, price-and-product collector (ŞOK, Tarım Kredi), 60 recipes with prices</w:t>
             </w:r>
           </w:p>
         </w:tc>
@@ -5980,7 +5980,7 @@
               <w:spacing w:after="60"/>
             </w:pPr>
             <w:r>
-              <w:t>Team-collected prices go stale or miss items</w:t>
+              <w:t>Collected prices go stale, a chain's site changes, or online prices differ from shelf prices</w:t>
             </w:r>
           </w:p>
         </w:tc>
@@ -6055,7 +6055,119 @@
               <w:spacing w:after="60"/>
             </w:pPr>
             <w:r>
-              <w:t>Biweekly price tour (~300 items, split across three members); price age shown on every price; stale price → "could not verify"; CI checks priced-SKU coverage ≥ 90%</w:t>
+              <w:t>Health check on every collection run; a chain whose data exceeds its age limit is reported as "could not verify"; one small adapter per chain; online vs. shelf prices sampled in stores (E3); CI checks priced-SKU coverage ≥ 90%</w:t>
+            </w:r>
+          </w:p>
+        </w:tc>
+      </w:tr>
+      <w:tr>
+        <w:tblPrEx>
+          <w:tblCellMar>
+            <w:top w:w="0" w:type="dxa"/>
+            <w:bottom w:w="0" w:type="dxa"/>
+          </w:tblCellMar>
+        </w:tblPrEx>
+        <w:trPr>
+          <w:cantSplit/>
+          <w:trHeight w:val="420"/>
+        </w:trPr>
+        <w:tc>
+          <w:tcPr>
+            <w:tcW w:w="3061" w:type="dxa"/>
+            <w:tcBorders>
+              <w:top w:val="single" w:sz="4" w:space="0" w:color="CCD3E0"/>
+              <w:left w:val="single" w:sz="4" w:space="0" w:color="CCD3E0"/>
+              <w:bottom w:val="single" w:sz="4" w:space="0" w:color="CCD3E0"/>
+              <w:right w:val="single" w:sz="4" w:space="0" w:color="CCD3E0"/>
+            </w:tcBorders>
+            <w:tcMar>
+              <w:top w:w="60" w:type="dxa"/>
+              <w:left w:w="90" w:type="dxa"/>
+              <w:bottom w:w="60" w:type="dxa"/>
+              <w:right w:w="90" w:type="dxa"/>
+            </w:tcMar>
+          </w:tcPr>
+          <w:p>
+            <w:pPr>
+              <w:spacing w:after="60"/>
+            </w:pPr>
+            <w:r>
+              <w:t>A chain objects to collection or refuses permission for the public release</w:t>
+            </w:r>
+          </w:p>
+        </w:tc>
+        <w:tc>
+          <w:tcPr>
+            <w:tcW w:w="1190" w:type="dxa"/>
+            <w:tcBorders>
+              <w:top w:val="single" w:sz="4" w:space="0" w:color="CCD3E0"/>
+              <w:left w:val="single" w:sz="4" w:space="0" w:color="CCD3E0"/>
+              <w:bottom w:val="single" w:sz="4" w:space="0" w:color="CCD3E0"/>
+              <w:right w:val="single" w:sz="4" w:space="0" w:color="CCD3E0"/>
+            </w:tcBorders>
+            <w:tcMar>
+              <w:top w:w="60" w:type="dxa"/>
+              <w:left w:w="90" w:type="dxa"/>
+              <w:bottom w:w="60" w:type="dxa"/>
+              <w:right w:w="90" w:type="dxa"/>
+            </w:tcMar>
+          </w:tcPr>
+          <w:p>
+            <w:pPr>
+              <w:spacing w:after="60"/>
+            </w:pPr>
+            <w:r>
+              <w:t>Low</w:t>
+            </w:r>
+          </w:p>
+        </w:tc>
+        <w:tc>
+          <w:tcPr>
+            <w:tcW w:w="1134" w:type="dxa"/>
+            <w:tcBorders>
+              <w:top w:val="single" w:sz="4" w:space="0" w:color="CCD3E0"/>
+              <w:left w:val="single" w:sz="4" w:space="0" w:color="CCD3E0"/>
+              <w:bottom w:val="single" w:sz="4" w:space="0" w:color="CCD3E0"/>
+              <w:right w:val="single" w:sz="4" w:space="0" w:color="CCD3E0"/>
+            </w:tcBorders>
+            <w:tcMar>
+              <w:top w:w="60" w:type="dxa"/>
+              <w:left w:w="90" w:type="dxa"/>
+              <w:bottom w:w="60" w:type="dxa"/>
+              <w:right w:w="90" w:type="dxa"/>
+            </w:tcMar>
+          </w:tcPr>
+          <w:p>
+            <w:pPr>
+              <w:spacing w:after="60"/>
+            </w:pPr>
+            <w:r>
+              <w:t>Medium</w:t>
+            </w:r>
+          </w:p>
+        </w:tc>
+        <w:tc>
+          <w:tcPr>
+            <w:tcW w:w="4819" w:type="dxa"/>
+            <w:tcBorders>
+              <w:top w:val="single" w:sz="4" w:space="0" w:color="CCD3E0"/>
+              <w:left w:val="single" w:sz="4" w:space="0" w:color="CCD3E0"/>
+              <w:bottom w:val="single" w:sz="4" w:space="0" w:color="CCD3E0"/>
+              <w:right w:val="single" w:sz="4" w:space="0" w:color="CCD3E0"/>
+            </w:tcBorders>
+            <w:tcMar>
+              <w:top w:w="60" w:type="dxa"/>
+              <w:left w:w="90" w:type="dxa"/>
+              <w:bottom w:w="60" w:type="dxa"/>
+              <w:right w:w="90" w:type="dxa"/>
+            </w:tcMar>
+          </w:tcPr>
+          <w:p>
+            <w:pPr>
+              <w:spacing w:after="60"/>
+            </w:pPr>
+            <w:r>
+              <w:t>Collection for that chain stops (rule K21); the adapter design lets another chain or a licensed source replace it; development, experiments and demo keep their recorded data</w:t>
             </w:r>
           </w:p>
         </w:tc>

</xml_diff>

<commit_message>
docs(plan): drop shelf-price check, proposal back to six pages with v5.2 price path
</commit_message>
<xml_diff>
--- a/plan/proposal/NutriScan_CSE491_Proposal_v0.docx
+++ b/plan/proposal/NutriScan_CSE491_Proposal_v0.docx
@@ -1119,7 +1119,7 @@
         <w:spacing w:after="60"/>
       </w:pPr>
       <w:r>
-        <w:t>• Beta (E3, spring): 20–40 households (≥10 with a hard constraint); plan/swap acceptance, planned price vs. in-store shelf price (periodic sample) and price freshness, use of expiring pantry items, week-4 retention.</w:t>
+        <w:t>• Beta (E3, spring): 20–40 households (≥10 with a hard constraint); plan/swap acceptance, price freshness, use of expiring pantry items, week-4 retention.</w:t>
       </w:r>
     </w:p>
     <w:p>
@@ -2817,7 +2817,7 @@
               <w:spacing w:after="60"/>
             </w:pPr>
             <w:r>
-              <w:t>The system shall maintain a catalogue for two pilot chains (ŞOK, Tarım Kredi) with pack sizes, ingredient text, prices, source and price age, filled by a collector limited to the recipe ingredient dictionary, and track the pantry (barcode, "bought" marks on the list, "finished").</w:t>
+              <w:t>The system shall keep a catalogue for two pilot chains (ŞOK, Tarım Kredi) with pack sizes, ingredients, prices, source and price age, and track the pantry (barcode, "bought", "finished").</w:t>
             </w:r>
           </w:p>
         </w:tc>
@@ -3827,7 +3827,7 @@
         <w:t>Data.</w:t>
       </w:r>
       <w:r>
-        <w:t xml:space="preserve"> Open Food Facts (ODbL) [17] as a mirrored source; a product and price catalogue for two pilot chains, ŞOK and Tarım Kredi, built by a weekly collector that reads only the products matching our recipe ingredient dictionary from the chains' public web catalogues, following robots.txt with an identified user agent and a rate limit, never bypassing access controls, keeping the source URL and date of every record and not republishing the data (the public price platform does not provide data or API access for third-party or academic use); stale prices are reported as "could not verify"; a public app-store release uses prices only with the chains' written permission or a licensed source; 200 team-written Turkish home recipes with an allergen ontology based on the Turkish Food Codex labelling regulation; a versioned health-rule threshold table with a source for every row (Turkish Food Codex nutrition-claim limits, WHO sugar and sodium guidelines [19][20]), reviewed by a dietitian; synthetic households for development.</w:t>
+        <w:t xml:space="preserve"> Open Food Facts (ODbL) [17] as a mirrored source; prices for two pilot chains (ŞOK, Tarım Kredi) from a weekly collector limited to our ingredient dictionary, within robots.txt and never bypassing access controls, each with source and date (public release only with the chains' permission; the public price platform gives no third-party access); 200 team-written Turkish home recipes with an allergen ontology based on the Turkish Food Codex labelling regulation; a versioned health-rule threshold table with a source for every row (Turkish Food Codex nutrition-claim limits, WHO sugar and sodium guidelines [19][20]), reviewed by a dietitian; synthetic households for development.</w:t>
       </w:r>
     </w:p>
     <w:tbl>
@@ -5980,7 +5980,7 @@
               <w:spacing w:after="60"/>
             </w:pPr>
             <w:r>
-              <w:t>Collected prices go stale, a chain's site changes, or online prices differ from shelf prices</w:t>
+              <w:t>Collected prices go stale, a site changes or a chain objects</w:t>
             </w:r>
           </w:p>
         </w:tc>
@@ -6055,119 +6055,7 @@
               <w:spacing w:after="60"/>
             </w:pPr>
             <w:r>
-              <w:t>Health check on every collection run; a chain whose data exceeds its age limit is reported as "could not verify"; one small adapter per chain; online vs. shelf prices sampled in stores (E3); CI checks priced-SKU coverage ≥ 90%</w:t>
-            </w:r>
-          </w:p>
-        </w:tc>
-      </w:tr>
-      <w:tr>
-        <w:tblPrEx>
-          <w:tblCellMar>
-            <w:top w:w="0" w:type="dxa"/>
-            <w:bottom w:w="0" w:type="dxa"/>
-          </w:tblCellMar>
-        </w:tblPrEx>
-        <w:trPr>
-          <w:cantSplit/>
-          <w:trHeight w:val="420"/>
-        </w:trPr>
-        <w:tc>
-          <w:tcPr>
-            <w:tcW w:w="3061" w:type="dxa"/>
-            <w:tcBorders>
-              <w:top w:val="single" w:sz="4" w:space="0" w:color="CCD3E0"/>
-              <w:left w:val="single" w:sz="4" w:space="0" w:color="CCD3E0"/>
-              <w:bottom w:val="single" w:sz="4" w:space="0" w:color="CCD3E0"/>
-              <w:right w:val="single" w:sz="4" w:space="0" w:color="CCD3E0"/>
-            </w:tcBorders>
-            <w:tcMar>
-              <w:top w:w="60" w:type="dxa"/>
-              <w:left w:w="90" w:type="dxa"/>
-              <w:bottom w:w="60" w:type="dxa"/>
-              <w:right w:w="90" w:type="dxa"/>
-            </w:tcMar>
-          </w:tcPr>
-          <w:p>
-            <w:pPr>
-              <w:spacing w:after="60"/>
-            </w:pPr>
-            <w:r>
-              <w:t>A chain objects to collection or refuses permission for the public release</w:t>
-            </w:r>
-          </w:p>
-        </w:tc>
-        <w:tc>
-          <w:tcPr>
-            <w:tcW w:w="1190" w:type="dxa"/>
-            <w:tcBorders>
-              <w:top w:val="single" w:sz="4" w:space="0" w:color="CCD3E0"/>
-              <w:left w:val="single" w:sz="4" w:space="0" w:color="CCD3E0"/>
-              <w:bottom w:val="single" w:sz="4" w:space="0" w:color="CCD3E0"/>
-              <w:right w:val="single" w:sz="4" w:space="0" w:color="CCD3E0"/>
-            </w:tcBorders>
-            <w:tcMar>
-              <w:top w:w="60" w:type="dxa"/>
-              <w:left w:w="90" w:type="dxa"/>
-              <w:bottom w:w="60" w:type="dxa"/>
-              <w:right w:w="90" w:type="dxa"/>
-            </w:tcMar>
-          </w:tcPr>
-          <w:p>
-            <w:pPr>
-              <w:spacing w:after="60"/>
-            </w:pPr>
-            <w:r>
-              <w:t>Low</w:t>
-            </w:r>
-          </w:p>
-        </w:tc>
-        <w:tc>
-          <w:tcPr>
-            <w:tcW w:w="1134" w:type="dxa"/>
-            <w:tcBorders>
-              <w:top w:val="single" w:sz="4" w:space="0" w:color="CCD3E0"/>
-              <w:left w:val="single" w:sz="4" w:space="0" w:color="CCD3E0"/>
-              <w:bottom w:val="single" w:sz="4" w:space="0" w:color="CCD3E0"/>
-              <w:right w:val="single" w:sz="4" w:space="0" w:color="CCD3E0"/>
-            </w:tcBorders>
-            <w:tcMar>
-              <w:top w:w="60" w:type="dxa"/>
-              <w:left w:w="90" w:type="dxa"/>
-              <w:bottom w:w="60" w:type="dxa"/>
-              <w:right w:w="90" w:type="dxa"/>
-            </w:tcMar>
-          </w:tcPr>
-          <w:p>
-            <w:pPr>
-              <w:spacing w:after="60"/>
-            </w:pPr>
-            <w:r>
-              <w:t>Medium</w:t>
-            </w:r>
-          </w:p>
-        </w:tc>
-        <w:tc>
-          <w:tcPr>
-            <w:tcW w:w="4819" w:type="dxa"/>
-            <w:tcBorders>
-              <w:top w:val="single" w:sz="4" w:space="0" w:color="CCD3E0"/>
-              <w:left w:val="single" w:sz="4" w:space="0" w:color="CCD3E0"/>
-              <w:bottom w:val="single" w:sz="4" w:space="0" w:color="CCD3E0"/>
-              <w:right w:val="single" w:sz="4" w:space="0" w:color="CCD3E0"/>
-            </w:tcBorders>
-            <w:tcMar>
-              <w:top w:w="60" w:type="dxa"/>
-              <w:left w:w="90" w:type="dxa"/>
-              <w:bottom w:w="60" w:type="dxa"/>
-              <w:right w:w="90" w:type="dxa"/>
-            </w:tcMar>
-          </w:tcPr>
-          <w:p>
-            <w:pPr>
-              <w:spacing w:after="60"/>
-            </w:pPr>
-            <w:r>
-              <w:t>Collection for that chain stops (rule K21); the adapter design lets another chain or a licensed source replace it; development, experiments and demo keep their recorded data</w:t>
+              <w:t>Health check per run; stale → "could not verify"; replaceable adapter per chain; stop on objection (K21); CI priced-SKU coverage ≥ 90%</w:t>
             </w:r>
           </w:p>
         </w:tc>
@@ -6774,7 +6662,7 @@
     </w:p>
     <w:p>
       <w:r>
-        <w:t>[5] Webrazzi, "Sofralar artık yapay zekâ destekli MAYA ile kuruluyor," 13.12.2024; LOG, "Migros yapay zekâ asistanı MAYA AI," 2026.</w:t>
+        <w:t>[5] Webrazzi, "Sofralar artık yapay zekâ destekli MAYA ile kuruluyor," 13.12.2024; LOG, "MAYA AI," 2026.</w:t>
       </w:r>
     </w:p>
     <w:p>
@@ -6804,7 +6692,7 @@
     </w:p>
     <w:p>
       <w:r>
-        <w:t>[11] M. Maillot et al., "Individual diet modeling translates nutrient recommendations into realistic and individual-specific food choices," Am. J. Clin. Nutr., vol. 91, no. 2, pp. 421–430, 2010, doi:10.3945/ajcn.2009.28426.</w:t>
+        <w:t>[11] M. Maillot et al., "Individual diet modeling translates nutrient recommendations into realistic and individual-specific food choices," Am. J. Clin. Nutr. 91(2):421–430, 2010, doi:10.3945/ajcn.2009.28426.</w:t>
       </w:r>
     </w:p>
     <w:p>
@@ -6824,12 +6712,12 @@
     </w:p>
     <w:p>
       <w:r>
-        <w:t>[15] K. Deb et al., "A fast and elitist multiobjective genetic algorithm: NSGA-II," IEEE TEVC, 6(2), 2002, doi:10.1109/4235.996017.</w:t>
+        <w:t>[15] K. Deb et al., "A fast and elitist multiobjective genetic algorithm: NSGA-II," IEEE TEVC 6(2), 2002, doi:10.1109/4235.996017.</w:t>
       </w:r>
     </w:p>
     <w:p>
       <w:r>
-        <w:t>[16] Google OR-Tools, https://developers.google.com/optimization ; Spring Modulith, https://spring.io/projects/spring-modulith</w:t>
+        <w:t>[16] Google OR-Tools, developers.google.com/optimization; Spring Modulith, spring.io/projects/spring-modulith</w:t>
       </w:r>
     </w:p>
     <w:p>
@@ -6839,7 +6727,7 @@
     </w:p>
     <w:p>
       <w:r>
-        <w:t>[18] Kişisel Verilerin Korunması Kanunu No. 6698 (amended by Law No. 7499, 2024); KVKK, "Üretken Yapay Zekâ ve Kişisel Verilerin Korunması Rehberi," 2025.</w:t>
+        <w:t>[18] KVKK No. 6698 (amended by No. 7499, 2024); KVKK, "Üretken Yapay Zekâ ve Kişisel Verilerin Korunması Rehberi," 2025.</w:t>
       </w:r>
     </w:p>
     <w:p>

</xml_diff>